<commit_message>
Perbarui dokumen alur: buku pribadi di cloud
Dokumen sebelumnya menggambarkan mode Pribadi hanya sebagai localStorage,
padahal sekarang catatan pribadi juga disalin ke server per akun.

- Tabel mode kini memisahkan Pribadi tanpa login, Pribadi dengan login
  (hanya akun itu), dan Keluarga (dua anggota).
- Alur penyimpanan pribadi: localStorage selalu dulu, salinan cloud
  setelah jeda, lalu kirim sisa saat halaman ditutup.
- Bagian baru 'Buku Pribadi di Cloud': endpoint personal/save, penjagaan
  revisi 409 tanpa menimpa salinan cloud, dan perangkat kosong yang
  diisi dari cloud tanpa menimpa perangkat yang sudah berisi.
- Peta data menambah personal_data / personal_data_parts.
- Tabel pemeriksaan menambah perangkat baru dan pemisahan buku pribadi
  antar pasangan.
- Skrip pembuat dokumen tidak lagi gagal bila file di Documents sedang
  dibuka Word; file proyek tetap ditulis.
</commit_message>
<xml_diff>
--- a/documents/Alur_Proyek_SavingDuit.docx
+++ b/documents/Alur_Proyek_SavingDuit.docx
@@ -509,7 +509,7 @@
                 <w:sz w:val="22"/>
                 <w:szCs w:val="22"/>
               </w:rPr>
-              <w:t xml:space="preserve">3. Jika Pribadi: muat profil dan catatan dari localStorage; buka PIN bila profil terkunci.</w:t>
+              <w:t xml:space="preserve">3. Jika Pribadi: muat profil dan catatan dari localStorage; buka PIN bila profil terkunci. Bila sudah login, salinan perangkat kosong dapat diisi dari cloud.</w:t>
             </w:r>
           </w:p>
         </w:tc>
@@ -652,9 +652,10 @@
         </w:tblBorders>
       </w:tblPr>
       <w:tblGrid>
-        <w:gridCol w:w="3302"/>
-        <w:gridCol w:w="3302"/>
-        <w:gridCol w:w="3302"/>
+        <w:gridCol w:w="2477"/>
+        <w:gridCol w:w="2477"/>
+        <w:gridCol w:w="2477"/>
+        <w:gridCol w:w="2477"/>
       </w:tblGrid>
       <w:tr>
         <w:trPr>
@@ -732,6 +733,30 @@
             </w:r>
           </w:p>
         </w:tc>
+        <w:tc>
+          <w:tcPr>
+            <w:tcBorders>
+              <w:bottom w:val="single" w:color="CBD5E1" w:sz="4"/>
+            </w:tcBorders>
+            <w:shd w:fill="1E3A8A" w:val="clear"/>
+          </w:tcPr>
+          <w:p>
+            <w:pPr>
+              <w:spacing w:after="70" w:before="70"/>
+            </w:pPr>
+            <w:r>
+              <w:rPr>
+                <w:rFonts w:ascii="Calibri" w:cs="Calibri" w:eastAsia="Calibri" w:hAnsi="Calibri"/>
+                <w:b/>
+                <w:bCs/>
+                <w:color w:val="FFFFFF"/>
+                <w:sz w:val="20"/>
+                <w:szCs w:val="20"/>
+              </w:rPr>
+              <w:t xml:space="preserve">Siapa yang bisa melihat</w:t>
+            </w:r>
+          </w:p>
+        </w:tc>
       </w:tr>
       <w:tr>
         <w:trPr>
@@ -757,55 +782,79 @@
                 <w:sz w:val="20"/>
                 <w:szCs w:val="20"/>
               </w:rPr>
-              <w:t xml:space="preserve">Pribadi</w:t>
-            </w:r>
-          </w:p>
-        </w:tc>
-        <w:tc>
-          <w:tcPr>
-            <w:tcBorders>
-              <w:bottom w:val="single" w:color="CBD5E1" w:sz="4"/>
-            </w:tcBorders>
-            <w:shd w:fill="F3F4F6" w:val="clear"/>
-          </w:tcPr>
-          <w:p>
-            <w:pPr>
-              <w:spacing w:after="70" w:before="70"/>
-            </w:pPr>
-            <w:r>
-              <w:rPr>
-                <w:rFonts w:ascii="Calibri" w:cs="Calibri" w:eastAsia="Calibri" w:hAnsi="Calibri"/>
-                <w:b w:val="false"/>
-                <w:bCs w:val="false"/>
-                <w:color w:val="243247"/>
-                <w:sz w:val="20"/>
-                <w:szCs w:val="20"/>
-              </w:rPr>
-              <w:t xml:space="preserve">localStorage per profil pada browser</w:t>
-            </w:r>
-          </w:p>
-        </w:tc>
-        <w:tc>
-          <w:tcPr>
-            <w:tcBorders>
-              <w:bottom w:val="single" w:color="CBD5E1" w:sz="4"/>
-            </w:tcBorders>
-            <w:shd w:fill="F3F4F6" w:val="clear"/>
-          </w:tcPr>
-          <w:p>
-            <w:pPr>
-              <w:spacing w:after="70" w:before="70"/>
-            </w:pPr>
-            <w:r>
-              <w:rPr>
-                <w:rFonts w:ascii="Calibri" w:cs="Calibri" w:eastAsia="Calibri" w:hAnsi="Calibri"/>
-                <w:b w:val="false"/>
-                <w:bCs w:val="false"/>
-                <w:color w:val="243247"/>
-                <w:sz w:val="20"/>
-                <w:szCs w:val="20"/>
-              </w:rPr>
-              <w:t xml:space="preserve">Tidak wajib untuk pencatatan lokal</w:t>
+              <w:t xml:space="preserve">Pribadi (tanpa login)</w:t>
+            </w:r>
+          </w:p>
+        </w:tc>
+        <w:tc>
+          <w:tcPr>
+            <w:tcBorders>
+              <w:bottom w:val="single" w:color="CBD5E1" w:sz="4"/>
+            </w:tcBorders>
+            <w:shd w:fill="F3F4F6" w:val="clear"/>
+          </w:tcPr>
+          <w:p>
+            <w:pPr>
+              <w:spacing w:after="70" w:before="70"/>
+            </w:pPr>
+            <w:r>
+              <w:rPr>
+                <w:rFonts w:ascii="Calibri" w:cs="Calibri" w:eastAsia="Calibri" w:hAnsi="Calibri"/>
+                <w:b w:val="false"/>
+                <w:bCs w:val="false"/>
+                <w:color w:val="243247"/>
+                <w:sz w:val="20"/>
+                <w:szCs w:val="20"/>
+              </w:rPr>
+              <w:t xml:space="preserve">localStorage per profil di browser</w:t>
+            </w:r>
+          </w:p>
+        </w:tc>
+        <w:tc>
+          <w:tcPr>
+            <w:tcBorders>
+              <w:bottom w:val="single" w:color="CBD5E1" w:sz="4"/>
+            </w:tcBorders>
+            <w:shd w:fill="F3F4F6" w:val="clear"/>
+          </w:tcPr>
+          <w:p>
+            <w:pPr>
+              <w:spacing w:after="70" w:before="70"/>
+            </w:pPr>
+            <w:r>
+              <w:rPr>
+                <w:rFonts w:ascii="Calibri" w:cs="Calibri" w:eastAsia="Calibri" w:hAnsi="Calibri"/>
+                <w:b w:val="false"/>
+                <w:bCs w:val="false"/>
+                <w:color w:val="243247"/>
+                <w:sz w:val="20"/>
+                <w:szCs w:val="20"/>
+              </w:rPr>
+              <w:t xml:space="preserve">Tidak wajib</w:t>
+            </w:r>
+          </w:p>
+        </w:tc>
+        <w:tc>
+          <w:tcPr>
+            <w:tcBorders>
+              <w:bottom w:val="single" w:color="CBD5E1" w:sz="4"/>
+            </w:tcBorders>
+            <w:shd w:fill="F3F4F6" w:val="clear"/>
+          </w:tcPr>
+          <w:p>
+            <w:pPr>
+              <w:spacing w:after="70" w:before="70"/>
+            </w:pPr>
+            <w:r>
+              <w:rPr>
+                <w:rFonts w:ascii="Calibri" w:cs="Calibri" w:eastAsia="Calibri" w:hAnsi="Calibri"/>
+                <w:b w:val="false"/>
+                <w:bCs w:val="false"/>
+                <w:color w:val="243247"/>
+                <w:sz w:val="20"/>
+                <w:szCs w:val="20"/>
+              </w:rPr>
+              <w:t xml:space="preserve">Hanya pengguna perangkat itu</w:t>
             </w:r>
           </w:p>
         </w:tc>
@@ -834,6 +883,107 @@
                 <w:sz w:val="20"/>
                 <w:szCs w:val="20"/>
               </w:rPr>
+              <w:t xml:space="preserve">Pribadi (sudah login)</w:t>
+            </w:r>
+          </w:p>
+        </w:tc>
+        <w:tc>
+          <w:tcPr>
+            <w:tcBorders>
+              <w:bottom w:val="single" w:color="CBD5E1" w:sz="4"/>
+            </w:tcBorders>
+            <w:shd w:fill="FFFFFF" w:val="clear"/>
+          </w:tcPr>
+          <w:p>
+            <w:pPr>
+              <w:spacing w:after="70" w:before="70"/>
+            </w:pPr>
+            <w:r>
+              <w:rPr>
+                <w:rFonts w:ascii="Calibri" w:cs="Calibri" w:eastAsia="Calibri" w:hAnsi="Calibri"/>
+                <w:b w:val="false"/>
+                <w:bCs w:val="false"/>
+                <w:color w:val="243247"/>
+                <w:sz w:val="20"/>
+                <w:szCs w:val="20"/>
+              </w:rPr>
+              <w:t xml:space="preserve">localStorage + salinan personal_data milik akun</w:t>
+            </w:r>
+          </w:p>
+        </w:tc>
+        <w:tc>
+          <w:tcPr>
+            <w:tcBorders>
+              <w:bottom w:val="single" w:color="CBD5E1" w:sz="4"/>
+            </w:tcBorders>
+            <w:shd w:fill="FFFFFF" w:val="clear"/>
+          </w:tcPr>
+          <w:p>
+            <w:pPr>
+              <w:spacing w:after="70" w:before="70"/>
+            </w:pPr>
+            <w:r>
+              <w:rPr>
+                <w:rFonts w:ascii="Calibri" w:cs="Calibri" w:eastAsia="Calibri" w:hAnsi="Calibri"/>
+                <w:b w:val="false"/>
+                <w:bCs w:val="false"/>
+                <w:color w:val="243247"/>
+                <w:sz w:val="20"/>
+                <w:szCs w:val="20"/>
+              </w:rPr>
+              <w:t xml:space="preserve">Tidak wajib untuk mencatat</w:t>
+            </w:r>
+          </w:p>
+        </w:tc>
+        <w:tc>
+          <w:tcPr>
+            <w:tcBorders>
+              <w:bottom w:val="single" w:color="CBD5E1" w:sz="4"/>
+            </w:tcBorders>
+            <w:shd w:fill="FFFFFF" w:val="clear"/>
+          </w:tcPr>
+          <w:p>
+            <w:pPr>
+              <w:spacing w:after="70" w:before="70"/>
+            </w:pPr>
+            <w:r>
+              <w:rPr>
+                <w:rFonts w:ascii="Calibri" w:cs="Calibri" w:eastAsia="Calibri" w:hAnsi="Calibri"/>
+                <w:b w:val="false"/>
+                <w:bCs w:val="false"/>
+                <w:color w:val="243247"/>
+                <w:sz w:val="20"/>
+                <w:szCs w:val="20"/>
+              </w:rPr>
+              <w:t xml:space="preserve">Hanya akun itu; anggota keluarga lain tidak bisa</w:t>
+            </w:r>
+          </w:p>
+        </w:tc>
+      </w:tr>
+      <w:tr>
+        <w:trPr>
+          <w:tblHeader w:val="off"/>
+        </w:trPr>
+        <w:tc>
+          <w:tcPr>
+            <w:tcBorders>
+              <w:bottom w:val="single" w:color="CBD5E1" w:sz="4"/>
+            </w:tcBorders>
+            <w:shd w:fill="F3F4F6" w:val="clear"/>
+          </w:tcPr>
+          <w:p>
+            <w:pPr>
+              <w:spacing w:after="70" w:before="70"/>
+            </w:pPr>
+            <w:r>
+              <w:rPr>
+                <w:rFonts w:ascii="Calibri" w:cs="Calibri" w:eastAsia="Calibri" w:hAnsi="Calibri"/>
+                <w:b w:val="false"/>
+                <w:bCs w:val="false"/>
+                <w:color w:val="243247"/>
+                <w:sz w:val="20"/>
+                <w:szCs w:val="20"/>
+              </w:rPr>
               <w:t xml:space="preserve">Keluarga</w:t>
             </w:r>
           </w:p>
@@ -843,46 +993,70 @@
             <w:tcBorders>
               <w:bottom w:val="single" w:color="CBD5E1" w:sz="4"/>
             </w:tcBorders>
-            <w:shd w:fill="FFFFFF" w:val="clear"/>
-          </w:tcPr>
-          <w:p>
-            <w:pPr>
-              <w:spacing w:after="70" w:before="70"/>
-            </w:pPr>
-            <w:r>
-              <w:rPr>
-                <w:rFonts w:ascii="Calibri" w:cs="Calibri" w:eastAsia="Calibri" w:hAnsi="Calibri"/>
-                <w:b w:val="false"/>
-                <w:bCs w:val="false"/>
-                <w:color w:val="243247"/>
-                <w:sz w:val="20"/>
-                <w:szCs w:val="20"/>
-              </w:rPr>
-              <w:t xml:space="preserve">Cloudflare Worker + database D1</w:t>
-            </w:r>
-          </w:p>
-        </w:tc>
-        <w:tc>
-          <w:tcPr>
-            <w:tcBorders>
-              <w:bottom w:val="single" w:color="CBD5E1" w:sz="4"/>
-            </w:tcBorders>
-            <w:shd w:fill="FFFFFF" w:val="clear"/>
-          </w:tcPr>
-          <w:p>
-            <w:pPr>
-              <w:spacing w:after="70" w:before="70"/>
-            </w:pPr>
-            <w:r>
-              <w:rPr>
-                <w:rFonts w:ascii="Calibri" w:cs="Calibri" w:eastAsia="Calibri" w:hAnsi="Calibri"/>
-                <w:b w:val="false"/>
-                <w:bCs w:val="false"/>
-                <w:color w:val="243247"/>
-                <w:sz w:val="20"/>
-                <w:szCs w:val="20"/>
-              </w:rPr>
-              <w:t xml:space="preserve">Wajib untuk memuat/menyimpan buku bersama</w:t>
+            <w:shd w:fill="F3F4F6" w:val="clear"/>
+          </w:tcPr>
+          <w:p>
+            <w:pPr>
+              <w:spacing w:after="70" w:before="70"/>
+            </w:pPr>
+            <w:r>
+              <w:rPr>
+                <w:rFonts w:ascii="Calibri" w:cs="Calibri" w:eastAsia="Calibri" w:hAnsi="Calibri"/>
+                <w:b w:val="false"/>
+                <w:bCs w:val="false"/>
+                <w:color w:val="243247"/>
+                <w:sz w:val="20"/>
+                <w:szCs w:val="20"/>
+              </w:rPr>
+              <w:t xml:space="preserve">Cloudflare Worker + D1 (family_data)</w:t>
+            </w:r>
+          </w:p>
+        </w:tc>
+        <w:tc>
+          <w:tcPr>
+            <w:tcBorders>
+              <w:bottom w:val="single" w:color="CBD5E1" w:sz="4"/>
+            </w:tcBorders>
+            <w:shd w:fill="F3F4F6" w:val="clear"/>
+          </w:tcPr>
+          <w:p>
+            <w:pPr>
+              <w:spacing w:after="70" w:before="70"/>
+            </w:pPr>
+            <w:r>
+              <w:rPr>
+                <w:rFonts w:ascii="Calibri" w:cs="Calibri" w:eastAsia="Calibri" w:hAnsi="Calibri"/>
+                <w:b w:val="false"/>
+                <w:bCs w:val="false"/>
+                <w:color w:val="243247"/>
+                <w:sz w:val="20"/>
+                <w:szCs w:val="20"/>
+              </w:rPr>
+              <w:t xml:space="preserve">Wajib untuk memuat/menyimpan</w:t>
+            </w:r>
+          </w:p>
+        </w:tc>
+        <w:tc>
+          <w:tcPr>
+            <w:tcBorders>
+              <w:bottom w:val="single" w:color="CBD5E1" w:sz="4"/>
+            </w:tcBorders>
+            <w:shd w:fill="F3F4F6" w:val="clear"/>
+          </w:tcPr>
+          <w:p>
+            <w:pPr>
+              <w:spacing w:after="70" w:before="70"/>
+            </w:pPr>
+            <w:r>
+              <w:rPr>
+                <w:rFonts w:ascii="Calibri" w:cs="Calibri" w:eastAsia="Calibri" w:hAnsi="Calibri"/>
+                <w:b w:val="false"/>
+                <w:bCs w:val="false"/>
+                <w:color w:val="243247"/>
+                <w:sz w:val="20"/>
+                <w:szCs w:val="20"/>
+              </w:rPr>
+              <w:t xml:space="preserve">Dua anggota keluarga yang sama</w:t>
             </w:r>
           </w:p>
         </w:tc>
@@ -2420,7 +2594,7 @@
                 <w:sz w:val="22"/>
                 <w:szCs w:val="22"/>
               </w:rPr>
-              <w:t xml:space="preserve">3. Jika mode Pribadi: simpan ke localStorage dengan kunci profil.</w:t>
+              <w:t xml:space="preserve">3. Mode Pribadi: simpan ke localStorage dengan kunci profil (selalu berhasil, meski offline).</w:t>
             </w:r>
           </w:p>
         </w:tc>
@@ -2442,12 +2616,70 @@
                 <w:sz w:val="22"/>
                 <w:szCs w:val="22"/>
               </w:rPr>
-              <w:t xml:space="preserve">4. Render kembali tampilan. Backup dapat diunduh melalui Pengaturan.</w:t>
+              <w:t xml:space="preserve">4. Jika sudah login: kirim salinan ke personal_data setelah jeda 1,2 detik.</w:t>
+            </w:r>
+          </w:p>
+        </w:tc>
+      </w:tr>
+      <w:tr>
+        <w:tc>
+          <w:tcPr>
+            <w:shd w:fill="EAF1FC" w:val="clear"/>
+          </w:tcPr>
+          <w:p>
+            <w:pPr>
+              <w:spacing w:after="90" w:before="90"/>
+              <w:jc w:val="center"/>
+            </w:pPr>
+            <w:r>
+              <w:rPr>
+                <w:rFonts w:ascii="Calibri" w:cs="Calibri" w:eastAsia="Calibri" w:hAnsi="Calibri"/>
+                <w:color w:val="243247"/>
+                <w:sz w:val="22"/>
+                <w:szCs w:val="22"/>
+              </w:rPr>
+              <w:t xml:space="preserve">5. Saat halaman ditutup, sisa perubahan dikirim langsung.</w:t>
+            </w:r>
+          </w:p>
+        </w:tc>
+      </w:tr>
+      <w:tr>
+        <w:tc>
+          <w:tcPr>
+            <w:shd w:fill="F3F4F6" w:val="clear"/>
+          </w:tcPr>
+          <w:p>
+            <w:pPr>
+              <w:spacing w:after="90" w:before="90"/>
+              <w:jc w:val="center"/>
+            </w:pPr>
+            <w:r>
+              <w:rPr>
+                <w:rFonts w:ascii="Calibri" w:cs="Calibri" w:eastAsia="Calibri" w:hAnsi="Calibri"/>
+                <w:color w:val="243247"/>
+                <w:sz w:val="22"/>
+                <w:szCs w:val="22"/>
+              </w:rPr>
+              <w:t xml:space="preserve">6. Render kembali tampilan. Backup dapat diunduh melalui Pengaturan.</w:t>
             </w:r>
           </w:p>
         </w:tc>
       </w:tr>
     </w:tbl>
+    <w:p>
+      <w:pPr>
+        <w:spacing w:after="130" w:line="285"/>
+      </w:pPr>
+      <w:r>
+        <w:rPr>
+          <w:rFonts w:ascii="Calibri" w:cs="Calibri" w:eastAsia="Calibri" w:hAnsi="Calibri"/>
+          <w:color w:val="243247"/>
+          <w:sz w:val="22"/>
+          <w:szCs w:val="22"/>
+        </w:rPr>
+        <w:t xml:space="preserve">Lokal tetap sumber utama. Salinan cloud hanya untuk membuka catatan di perangkat lain, bukan pengganti backup unduhan.</w:t>
+      </w:r>
+    </w:p>
     <w:p>
       <w:pPr>
         <w:pStyle w:val="Heading2"/>
@@ -2460,7 +2692,7 @@
           <w:sz w:val="22"/>
           <w:szCs w:val="22"/>
         </w:rPr>
-        <w:t xml:space="preserve">B. Penyimpanan Keluarga</w:t>
+        <w:t xml:space="preserve">C. Buku Pribadi di Cloud</w:t>
       </w:r>
     </w:p>
     <w:tbl>
@@ -2495,7 +2727,7 @@
                 <w:sz w:val="22"/>
                 <w:szCs w:val="22"/>
               </w:rPr>
-              <w:t xml:space="preserve">1. Ambil koleksi buku bersama dari App.db.</w:t>
+              <w:t xml:space="preserve">1. Akun masuk, lalu aplikasi memeriksa sesi dan nomor revisi buku pribadi.</w:t>
             </w:r>
           </w:p>
         </w:tc>
@@ -2517,7 +2749,7 @@
                 <w:sz w:val="22"/>
                 <w:szCs w:val="22"/>
               </w:rPr>
-              <w:t xml:space="preserve">2. Kirim POST /api/family/save berisi revision dan book.</w:t>
+              <w:t xml:space="preserve">2. Kirim POST /api/family/personal/save berisi revision dan book.</w:t>
             </w:r>
           </w:p>
         </w:tc>
@@ -2539,7 +2771,7 @@
                 <w:sz w:val="22"/>
                 <w:szCs w:val="22"/>
               </w:rPr>
-              <w:t xml:space="preserve">3. Server memeriksa sesi, bentuk data, dan revisi.</w:t>
+              <w:t xml:space="preserve">3. Server memeriksa sesi, bentuk buku, dan kecocokan revisi.</w:t>
             </w:r>
           </w:p>
         </w:tc>
@@ -2561,7 +2793,7 @@
                 <w:sz w:val="22"/>
                 <w:szCs w:val="22"/>
               </w:rPr>
-              <w:t xml:space="preserve">4. Revisi cocok: simpan buku ke D1 dan naikkan revisi; balas 200.</w:t>
+              <w:t xml:space="preserve">4. Revisi cocok: potongan isi diganti, revisi naik, balas 200.</w:t>
             </w:r>
           </w:p>
         </w:tc>
@@ -2583,7 +2815,7 @@
                 <w:sz w:val="22"/>
                 <w:szCs w:val="22"/>
               </w:rPr>
-              <w:t xml:space="preserve">5. Revisi berbeda: tolak 409; klien menampilkan pesan lalu memuat buku server terbaru.</w:t>
+              <w:t xml:space="preserve">5. Revisi berbeda: balas 409 dan salinan cloud TIDAK ditimpa.</w:t>
             </w:r>
           </w:p>
         </w:tc>
@@ -2605,7 +2837,7 @@
                 <w:sz w:val="22"/>
                 <w:szCs w:val="22"/>
               </w:rPr>
-              <w:t xml:space="preserve">6. Jika offline/gagal: tampilkan perubahan belum tersimpan.</w:t>
+              <w:t xml:space="preserve">6. Perangkat baru: bila catatan lokal masih kosong, isi cloud dimuatkan; bila sudah berisi, lokal dibiarkan.</w:t>
             </w:r>
           </w:p>
         </w:tc>
@@ -2622,7 +2854,7 @@
           <w:sz w:val="22"/>
           <w:szCs w:val="22"/>
         </w:rPr>
-        <w:t xml:space="preserve">Konflik bukan penggabungan otomatis. Perubahan klien yang ditolak tidak dianggap tersimpan dan dapat tergantikan saat versi server dimuat. Periksa buku terbaru sebelum mengulang perubahan.</w:t>
+        <w:t xml:space="preserve">Kunci data buku pribadi adalah user_id, bukan family_id. Pasangan dalam satu keluarga tetap tidak dapat membaca isi buku pribadi satu sama lain.</w:t>
       </w:r>
     </w:p>
     <w:p>
@@ -2643,7 +2875,7 @@
           <w:sz w:val="22"/>
           <w:szCs w:val="22"/>
         </w:rPr>
-        <w:t xml:space="preserve">Buku keluarga disimpan dalam potongan teks 90.000 karakter di family_data_parts. Permintaan dibatasi 500.000 karakter; ini bukan kapasitas tanpa batas.</w:t>
+        <w:t xml:space="preserve">Bila salinan pribadi bentrok, aplikasi memberi tahu dan menyarankan mengunduh backup lokal lebih dulu. Perubahan tidak digabung otomatis.</w:t>
       </w:r>
     </w:p>
     <w:p>
@@ -3185,7 +3417,7 @@
                 <w:sz w:val="20"/>
                 <w:szCs w:val="20"/>
               </w:rPr>
-              <w:t xml:space="preserve">Revisi, data lama, dan potongan buku baru.</w:t>
+              <w:t xml:space="preserve">Revisi, data lama, dan potongan buku bersama.</w:t>
             </w:r>
           </w:p>
         </w:tc>
@@ -3214,6 +3446,59 @@
                 <w:sz w:val="20"/>
                 <w:szCs w:val="20"/>
               </w:rPr>
+              <w:t xml:space="preserve">personal_data / personal_data_parts</w:t>
+            </w:r>
+          </w:p>
+        </w:tc>
+        <w:tc>
+          <w:tcPr>
+            <w:tcBorders>
+              <w:bottom w:val="single" w:color="CBD5E1" w:sz="4"/>
+            </w:tcBorders>
+            <w:shd w:fill="F3F4F6" w:val="clear"/>
+          </w:tcPr>
+          <w:p>
+            <w:pPr>
+              <w:spacing w:after="70" w:before="70"/>
+            </w:pPr>
+            <w:r>
+              <w:rPr>
+                <w:rFonts w:ascii="Calibri" w:cs="Calibri" w:eastAsia="Calibri" w:hAnsi="Calibri"/>
+                <w:b w:val="false"/>
+                <w:bCs w:val="false"/>
+                <w:color w:val="243247"/>
+                <w:sz w:val="20"/>
+                <w:szCs w:val="20"/>
+              </w:rPr>
+              <w:t xml:space="preserve">Buku pribadi per akun (kunci user_id), tidak terlihat anggota keluarga lain.</w:t>
+            </w:r>
+          </w:p>
+        </w:tc>
+      </w:tr>
+      <w:tr>
+        <w:trPr>
+          <w:tblHeader w:val="off"/>
+        </w:trPr>
+        <w:tc>
+          <w:tcPr>
+            <w:tcBorders>
+              <w:bottom w:val="single" w:color="CBD5E1" w:sz="4"/>
+            </w:tcBorders>
+            <w:shd w:fill="FFFFFF" w:val="clear"/>
+          </w:tcPr>
+          <w:p>
+            <w:pPr>
+              <w:spacing w:after="70" w:before="70"/>
+            </w:pPr>
+            <w:r>
+              <w:rPr>
+                <w:rFonts w:ascii="Calibri" w:cs="Calibri" w:eastAsia="Calibri" w:hAnsi="Calibri"/>
+                <w:b w:val="false"/>
+                <w:bCs w:val="false"/>
+                <w:color w:val="243247"/>
+                <w:sz w:val="20"/>
+                <w:szCs w:val="20"/>
+              </w:rPr>
               <w:t xml:space="preserve">/api/sync</w:t>
             </w:r>
           </w:p>
@@ -3223,7 +3508,7 @@
             <w:tcBorders>
               <w:bottom w:val="single" w:color="CBD5E1" w:sz="4"/>
             </w:tcBorders>
-            <w:shd w:fill="F3F4F6" w:val="clear"/>
+            <w:shd w:fill="FFFFFF" w:val="clear"/>
           </w:tcPr>
           <w:p>
             <w:pPr>
@@ -3447,7 +3732,113 @@
                 <w:sz w:val="20"/>
                 <w:szCs w:val="20"/>
               </w:rPr>
-              <w:t xml:space="preserve">Catatan lokal dapat ditambah dan dibuka kembali.</w:t>
+              <w:t xml:space="preserve">Catatan lokal dapat ditambah dan dibuka kembali; salinan cloud tertunda.</w:t>
+            </w:r>
+          </w:p>
+        </w:tc>
+      </w:tr>
+      <w:tr>
+        <w:trPr>
+          <w:tblHeader w:val="off"/>
+        </w:trPr>
+        <w:tc>
+          <w:tcPr>
+            <w:tcBorders>
+              <w:bottom w:val="single" w:color="CBD5E1" w:sz="4"/>
+            </w:tcBorders>
+            <w:shd w:fill="FFFFFF" w:val="clear"/>
+          </w:tcPr>
+          <w:p>
+            <w:pPr>
+              <w:spacing w:after="70" w:before="70"/>
+            </w:pPr>
+            <w:r>
+              <w:rPr>
+                <w:rFonts w:ascii="Calibri" w:cs="Calibri" w:eastAsia="Calibri" w:hAnsi="Calibri"/>
+                <w:b w:val="false"/>
+                <w:bCs w:val="false"/>
+                <w:color w:val="243247"/>
+                <w:sz w:val="20"/>
+                <w:szCs w:val="20"/>
+              </w:rPr>
+              <w:t xml:space="preserve">Perangkat baru</w:t>
+            </w:r>
+          </w:p>
+        </w:tc>
+        <w:tc>
+          <w:tcPr>
+            <w:tcBorders>
+              <w:bottom w:val="single" w:color="CBD5E1" w:sz="4"/>
+            </w:tcBorders>
+            <w:shd w:fill="FFFFFF" w:val="clear"/>
+          </w:tcPr>
+          <w:p>
+            <w:pPr>
+              <w:spacing w:after="70" w:before="70"/>
+            </w:pPr>
+            <w:r>
+              <w:rPr>
+                <w:rFonts w:ascii="Calibri" w:cs="Calibri" w:eastAsia="Calibri" w:hAnsi="Calibri"/>
+                <w:b w:val="false"/>
+                <w:bCs w:val="false"/>
+                <w:color w:val="243247"/>
+                <w:sz w:val="20"/>
+                <w:szCs w:val="20"/>
+              </w:rPr>
+              <w:t xml:space="preserve">Perangkat tanpa transaksi memuat salinan pribadi dari cloud; perangkat yang sudah berisi tidak ditimpa.</w:t>
+            </w:r>
+          </w:p>
+        </w:tc>
+      </w:tr>
+      <w:tr>
+        <w:trPr>
+          <w:tblHeader w:val="off"/>
+        </w:trPr>
+        <w:tc>
+          <w:tcPr>
+            <w:tcBorders>
+              <w:bottom w:val="single" w:color="CBD5E1" w:sz="4"/>
+            </w:tcBorders>
+            <w:shd w:fill="F3F4F6" w:val="clear"/>
+          </w:tcPr>
+          <w:p>
+            <w:pPr>
+              <w:spacing w:after="70" w:before="70"/>
+            </w:pPr>
+            <w:r>
+              <w:rPr>
+                <w:rFonts w:ascii="Calibri" w:cs="Calibri" w:eastAsia="Calibri" w:hAnsi="Calibri"/>
+                <w:b w:val="false"/>
+                <w:bCs w:val="false"/>
+                <w:color w:val="243247"/>
+                <w:sz w:val="20"/>
+                <w:szCs w:val="20"/>
+              </w:rPr>
+              <w:t xml:space="preserve">Buku pribadi dan pasangan</w:t>
+            </w:r>
+          </w:p>
+        </w:tc>
+        <w:tc>
+          <w:tcPr>
+            <w:tcBorders>
+              <w:bottom w:val="single" w:color="CBD5E1" w:sz="4"/>
+            </w:tcBorders>
+            <w:shd w:fill="F3F4F6" w:val="clear"/>
+          </w:tcPr>
+          <w:p>
+            <w:pPr>
+              <w:spacing w:after="70" w:before="70"/>
+            </w:pPr>
+            <w:r>
+              <w:rPr>
+                <w:rFonts w:ascii="Calibri" w:cs="Calibri" w:eastAsia="Calibri" w:hAnsi="Calibri"/>
+                <w:b w:val="false"/>
+                <w:bCs w:val="false"/>
+                <w:color w:val="243247"/>
+                <w:sz w:val="20"/>
+                <w:szCs w:val="20"/>
+              </w:rPr>
+              <w:t xml:space="preserve">Pasangan melihat buku pribadi kosong dan tidak dapat membaca isi milik pasangannya.</w:t>
             </w:r>
           </w:p>
         </w:tc>

</xml_diff>

<commit_message>
Pendaftaran dibuka: tiap akun baru dapat buku sendiri
- worker/family.mjs: penjaga 'hanya satu keluarga' (family_activation) dilepas
  dari jalur activate; akun lama tetap utuh dan bisa masuk
- public/js/views.js: tab Masuk / Buat akun di kartu gerbang, plus kartu kode
  pemulihan sekali tampil dan tombol 'Masuk sekarang'
- public/js/app.js: keadaan _gerbangPesan/_gerbangDaftar/_gerbangKode/_gerbangAkun
- css: .gerbang-tab, .gerbang-tip, .gerbang-kode
- tests/family-daftar.mjs: 18 uji pendaftaran terbuka (khusus server lokal)
- tests/family-e2e.mjs: harapan lama 'satu keluarga' diganti pendaftaran terbuka
- docs-build/gen-alur.cjs: alur akun diperbarui
</commit_message>
<xml_diff>
--- a/documents/Alur_Proyek_SavingDuit.docx
+++ b/documents/Alur_Proyek_SavingDuit.docx
@@ -1173,7 +1173,7 @@
                 <w:sz w:val="22"/>
                 <w:szCs w:val="22"/>
               </w:rPr>
-              <w:t xml:space="preserve">3. Server memeriksa apakah keluarga sudah pernah dibuat.</w:t>
+              <w:t xml:space="preserve">3. Server membuat keluarga baru, akun pemilik, dan kode pemulihan.</w:t>
             </w:r>
           </w:p>
         </w:tc>
@@ -1195,7 +1195,7 @@
                 <w:sz w:val="22"/>
                 <w:szCs w:val="22"/>
               </w:rPr>
-              <w:t xml:space="preserve">4. Jika belum: buat keluarga, akun pemilik, dan kode pemulihan. Jika sudah: tolak dengan 409.</w:t>
+              <w:t xml:space="preserve">4. Kode pemulihan tampil sekali di kartu yang sama, lalu pengguna menekan Masuk sekarang.</w:t>
             </w:r>
           </w:p>
         </w:tc>
@@ -1217,29 +1217,7 @@
                 <w:sz w:val="22"/>
                 <w:szCs w:val="22"/>
               </w:rPr>
-              <w:t xml:space="preserve">5. Simpan kode pemulihan yang hanya ditampilkan sekali.</w:t>
-            </w:r>
-          </w:p>
-        </w:tc>
-      </w:tr>
-      <w:tr>
-        <w:tc>
-          <w:tcPr>
-            <w:shd w:fill="F3F4F6" w:val="clear"/>
-          </w:tcPr>
-          <w:p>
-            <w:pPr>
-              <w:spacing w:after="90" w:before="90"/>
-              <w:jc w:val="center"/>
-            </w:pPr>
-            <w:r>
-              <w:rPr>
-                <w:rFonts w:ascii="Calibri" w:cs="Calibri" w:eastAsia="Calibri" w:hAnsi="Calibri"/>
-                <w:color w:val="243247"/>
-                <w:sz w:val="22"/>
-                <w:szCs w:val="22"/>
-              </w:rPr>
-              <w:t xml:space="preserve">6. Pilih Masuk dan gunakan username/password tersebut. Pendaftaran tidak langsung membuat sesi login.</w:t>
+              <w:t xml:space="preserve">5. Pendaftaran berikutnya juga boleh: setiap akun baru mendapat keluarga dan buku sendiri.</w:t>
             </w:r>
           </w:p>
         </w:tc>
@@ -3364,7 +3342,7 @@
                 <w:sz w:val="20"/>
                 <w:szCs w:val="20"/>
               </w:rPr>
-              <w:t xml:space="preserve">Penanda keluarga pertama; tetap dipakai meskipun kode aktivasi dihapus.</w:t>
+              <w:t xml:space="preserve">Penanda buku lama; tidak lagi dipakai sebagai penjaga pendaftaran.</w:t>
             </w:r>
           </w:p>
         </w:tc>
@@ -3612,7 +3590,7 @@
           <w:sz w:val="22"/>
           <w:szCs w:val="22"/>
         </w:rPr>
-        <w:t xml:space="preserve">Tanpa kode aktivasi, instalasi baru yang belum memiliki keluarga bersifat siapa-cepat membuat keluarga pertama. Setelah keluarga ada, pendaftaran keluarga tambahan ditolak.</w:t>
+        <w:t xml:space="preserve">Pendaftaran bersifat terbuka: siapa pun yang memegang alamat aplikasi boleh membuat akun, dan tiap akun mendapat buku catatannya sendiri (keluarga terpisah). Tabel family_activation tidak lagi menjadi penjaga pendaftaran; barisnya dipertahankan agar akun yang sudah ada tetap dapat masuk.</w:t>
       </w:r>
     </w:p>
     <w:tbl>
@@ -4103,7 +4081,7 @@
                 <w:sz w:val="20"/>
                 <w:szCs w:val="20"/>
               </w:rPr>
-              <w:t xml:space="preserve">Pendaftaran ditolak setelah keluarga pertama dibuat.</w:t>
+              <w:t xml:space="preserve">Pendaftaran akun lain berhasil dan mendapat buku kosong sendiri; buku keluarga pertama tidak terlihat.</w:t>
             </w:r>
           </w:p>
         </w:tc>

</xml_diff>